<commit_message>
MARMA: incorpora ajustes do Arnessen na proposta mensal (2,5 salários mínimos, atuação judicial e extrajudicial), reuniões, versão válida em português, CRC e rodapé
Co-Authored-By: Claude Opus 5.5 <noreply@anthropic.com>
Claude-Session: https://claude.ai/code/session_015JqxKrgtCDmsAVzcGPXiY4
</commit_message>
<xml_diff>
--- a/propostas/marma-ltda/01-proposta-planejamento-trabalhista.docx
+++ b/propostas/marma-ltda/01-proposta-planejamento-trabalhista.docx
@@ -460,7 +460,7 @@
                 <w:sz w:val="20"/>
                 <w:szCs w:val="20"/>
               </w:rPr>
-              <w:t xml:space="preserve">09/10/2026</w:t>
+              <w:t xml:space="preserve">20/10/2026</w:t>
             </w:r>
             <w:r>
               <w:rPr>
@@ -568,6 +568,87 @@
                 <w:szCs w:val="17"/>
               </w:rPr>
               <w:t xml:space="preserve">Prazo de execução: 30 dias</w:t>
+            </w:r>
+          </w:p>
+        </w:tc>
+      </w:tr>
+    </w:tbl>
+    <w:p>
+      <w:pPr>
+        <w:keepNext w:val="false"/>
+        <w:spacing w:after="160"/>
+      </w:pPr>
+    </w:p>
+    <w:tbl>
+      <w:tblPr>
+        <w:tblW w:type="dxa" w:w="9638"/>
+        <w:tblBorders>
+          <w:top w:val="single" w:color="auto" w:sz="4"/>
+          <w:left w:val="single" w:color="auto" w:sz="4"/>
+          <w:bottom w:val="single" w:color="auto" w:sz="4"/>
+          <w:right w:val="single" w:color="auto" w:sz="4"/>
+          <w:insideH w:val="single" w:color="auto" w:sz="4"/>
+          <w:insideV w:val="single" w:color="auto" w:sz="4"/>
+        </w:tblBorders>
+        <w:tblLayout w:type="fixed"/>
+      </w:tblPr>
+      <w:tblGrid>
+        <w:gridCol w:w="9638"/>
+      </w:tblGrid>
+      <w:tr>
+        <w:tc>
+          <w:tcPr>
+            <w:tcW w:type="dxa" w:w="9638"/>
+            <w:tcBorders>
+              <w:top w:val="none" w:color="FFFFFF" w:sz="0"/>
+              <w:left w:val="single" w:color="00AF58" w:sz="24"/>
+              <w:bottom w:val="none" w:color="FFFFFF" w:sz="0"/>
+              <w:right w:val="none" w:color="FFFFFF" w:sz="0"/>
+            </w:tcBorders>
+            <w:shd w:fill="F5F6F7" w:color="auto" w:val="clear"/>
+            <w:tcMar>
+              <w:top w:type="dxa" w:w="140"/>
+              <w:left w:type="dxa" w:w="200"/>
+              <w:bottom w:type="dxa" w:w="140"/>
+              <w:right w:type="dxa" w:w="200"/>
+            </w:tcMar>
+          </w:tcPr>
+          <w:p>
+            <w:pPr>
+              <w:spacing w:after="0" w:before="0" w:line="276"/>
+            </w:pPr>
+            <w:r>
+              <w:rPr>
+                <w:rFonts w:ascii="Calibri" w:cs="Calibri" w:eastAsia="Calibri" w:hAnsi="Calibri"/>
+                <w:b w:val="false"/>
+                <w:bCs w:val="false"/>
+                <w:color w:val="1A1A1A"/>
+                <w:sz w:val="18"/>
+                <w:szCs w:val="18"/>
+              </w:rPr>
+              <w:t xml:space="preserve"/>
+            </w:r>
+            <w:r>
+              <w:rPr>
+                <w:rFonts w:ascii="Calibri" w:cs="Calibri" w:eastAsia="Calibri" w:hAnsi="Calibri"/>
+                <w:b/>
+                <w:bCs/>
+                <w:color w:val="1A1A1A"/>
+                <w:sz w:val="18"/>
+                <w:szCs w:val="18"/>
+              </w:rPr>
+              <w:t xml:space="preserve">Versão válida.</w:t>
+            </w:r>
+            <w:r>
+              <w:rPr>
+                <w:rFonts w:ascii="Calibri" w:cs="Calibri" w:eastAsia="Calibri" w:hAnsi="Calibri"/>
+                <w:b w:val="false"/>
+                <w:bCs w:val="false"/>
+                <w:color w:val="1A1A1A"/>
+                <w:sz w:val="18"/>
+                <w:szCs w:val="18"/>
+              </w:rPr>
+              <w:t xml:space="preserve"> Esta Proposta nº 001/2026 é a versão oficial. A versão em espanhol é apresentada apenas para facilitar o entendimento; qualquer dúvida será esclarecida pela versão em português.</w:t>
             </w:r>
           </w:p>
         </w:tc>
@@ -4780,7 +4861,7 @@
                       <w:sz w:val="15"/>
                       <w:szCs w:val="15"/>
                     </w:rPr>
-                    <w:t xml:space="preserve">Contador · Metabase Contabilidade</w:t>
+                    <w:t xml:space="preserve">Contador · CRC/PE 028.529 · Metabase Contabilidade</w:t>
                   </w:r>
                 </w:p>
               </w:tc>
@@ -4875,7 +4956,7 @@
                       <w:sz w:val="15"/>
                       <w:szCs w:val="15"/>
                     </w:rPr>
-                    <w:t xml:space="preserve">Advogado · OAB/PE 70.236</w:t>
+                    <w:t xml:space="preserve">Advogado · OAB/PE 70.236 · Arnessen Cintra Advocacia</w:t>
                   </w:r>
                 </w:p>
               </w:tc>
@@ -4965,7 +5046,7 @@
         <w:sz w:val="15"/>
         <w:szCs w:val="15"/>
       </w:rPr>
-      <w:t xml:space="preserve"> · desde 2015 · 11 anos     |     </w:t>
+      <w:t xml:space="preserve"> · desde 2015     |     </w:t>
     </w:r>
     <w:r>
       <w:rPr>

</xml_diff>